<commit_message>
docs(practica01): actualizacion de la bitácora del día 1
</commit_message>
<xml_diff>
--- a/tareas/Duenas_Harim_Dia01.docx
+++ b/tareas/Duenas_Harim_Dia01.docx
@@ -117,18 +117,8 @@
                 <w:color w:val="174C83"/>
                 <w:sz w:val="16"/>
               </w:rPr>
-              <w:t xml:space="preserve">TIEMPO Y </w:t>
-            </w:r>
-            <w:proofErr w:type="gramStart"/>
-            <w:r>
-              <w:rPr>
-                <w:b/>
-                <w:color w:val="174C83"/>
-                <w:sz w:val="16"/>
-              </w:rPr>
-              <w:t>TICKETS</w:t>
-            </w:r>
-            <w:proofErr w:type="gramEnd"/>
+              <w:t>TIEMPO Y TICKETS</w:t>
+            </w:r>
           </w:p>
         </w:tc>
       </w:tr>
@@ -159,19 +149,11 @@
               </w:rPr>
               <w:t xml:space="preserve">Nombre: </w:t>
             </w:r>
-            <w:proofErr w:type="spellStart"/>
-            <w:r>
-              <w:rPr>
-                <w:sz w:val="17"/>
-              </w:rPr>
-              <w:t>Harim</w:t>
-            </w:r>
-            <w:proofErr w:type="spellEnd"/>
-            <w:r>
-              <w:rPr>
-                <w:sz w:val="17"/>
-              </w:rPr>
-              <w:t xml:space="preserve"> Jesús Enrique Dueñas Dávila</w:t>
+            <w:r>
+              <w:rPr>
+                <w:sz w:val="17"/>
+              </w:rPr>
+              <w:t>Harim Jesús Enrique Dueñas Dávila</w:t>
             </w:r>
             <w:r>
               <w:rPr>
@@ -274,20 +256,7 @@
                 <w:sz w:val="17"/>
               </w:rPr>
               <w:br/>
-            </w:r>
-            <w:proofErr w:type="gramStart"/>
-            <w:r>
-              <w:rPr>
-                <w:sz w:val="17"/>
-              </w:rPr>
-              <w:t>Tickets</w:t>
-            </w:r>
-            <w:proofErr w:type="gramEnd"/>
-            <w:r>
-              <w:rPr>
-                <w:sz w:val="17"/>
-              </w:rPr>
-              <w:t>: BUG</w:t>
+              <w:t>Tickets: BUG</w:t>
             </w:r>
             <w:r>
               <w:rPr>
@@ -488,35 +457,7 @@
               <w:rPr>
                 <w:sz w:val="17"/>
               </w:rPr>
-              <w:t>Preparar proyecto (</w:t>
-            </w:r>
-            <w:proofErr w:type="spellStart"/>
-            <w:r>
-              <w:rPr>
-                <w:sz w:val="17"/>
-              </w:rPr>
-              <w:t>flutter</w:t>
-            </w:r>
-            <w:proofErr w:type="spellEnd"/>
-            <w:r>
-              <w:rPr>
-                <w:sz w:val="17"/>
-              </w:rPr>
-              <w:t xml:space="preserve"> créate, pub </w:t>
-            </w:r>
-            <w:proofErr w:type="spellStart"/>
-            <w:r>
-              <w:rPr>
-                <w:sz w:val="17"/>
-              </w:rPr>
-              <w:t>get</w:t>
-            </w:r>
-            <w:proofErr w:type="spellEnd"/>
-            <w:r>
-              <w:rPr>
-                <w:sz w:val="17"/>
-              </w:rPr>
-              <w:t>, Modo desarrollador).</w:t>
+              <w:t>Preparar proyecto (flutter créate, pub get, Modo desarrollador).</w:t>
             </w:r>
           </w:p>
         </w:tc>
@@ -539,21 +480,7 @@
               <w:rPr>
                 <w:sz w:val="17"/>
               </w:rPr>
-              <w:t xml:space="preserve">Proyecto preparado correctamente y corriendo en Brave en local host (Yo lo configure para que me abriese </w:t>
-            </w:r>
-            <w:proofErr w:type="spellStart"/>
-            <w:r>
-              <w:rPr>
-                <w:sz w:val="17"/>
-              </w:rPr>
-              <w:t>Breave</w:t>
-            </w:r>
-            <w:proofErr w:type="spellEnd"/>
-            <w:r>
-              <w:rPr>
-                <w:sz w:val="17"/>
-              </w:rPr>
-              <w:t xml:space="preserve"> en vez de Chrome por comodidad).</w:t>
+              <w:t>Proyecto preparado correctamente y corriendo en Brave en local host (Yo lo configure para que me abriese Breave en vez de Chrome por comodidad).</w:t>
             </w:r>
           </w:p>
         </w:tc>
@@ -636,21 +563,7 @@
               <w:rPr>
                 <w:sz w:val="17"/>
               </w:rPr>
-              <w:t xml:space="preserve">Exploración inicial de la </w:t>
-            </w:r>
-            <w:proofErr w:type="gramStart"/>
-            <w:r>
-              <w:rPr>
-                <w:sz w:val="17"/>
-              </w:rPr>
-              <w:t>app</w:t>
-            </w:r>
-            <w:proofErr w:type="gramEnd"/>
-            <w:r>
-              <w:rPr>
-                <w:sz w:val="17"/>
-              </w:rPr>
-              <w:t>.</w:t>
+              <w:t>Exploración inicial de la app.</w:t>
             </w:r>
           </w:p>
         </w:tc>
@@ -1060,30 +973,8 @@
               <w:rPr>
                 <w:sz w:val="17"/>
               </w:rPr>
-              <w:t xml:space="preserve">Hacer el primer </w:t>
-            </w:r>
-            <w:proofErr w:type="spellStart"/>
-            <w:r>
-              <w:rPr>
-                <w:sz w:val="17"/>
-              </w:rPr>
-              <w:t>commit</w:t>
-            </w:r>
-            <w:proofErr w:type="spellEnd"/>
-            <w:r>
-              <w:rPr>
-                <w:sz w:val="17"/>
-              </w:rPr>
-              <w:t xml:space="preserve"> y subir la primera parte de la </w:t>
-            </w:r>
-            <w:proofErr w:type="spellStart"/>
-            <w:r>
-              <w:rPr>
-                <w:sz w:val="17"/>
-              </w:rPr>
-              <w:t>bitacora</w:t>
-            </w:r>
-            <w:proofErr w:type="spellEnd"/>
+              <w:t>Hacer el primer commit y subir la primera parte de la bitacora</w:t>
+            </w:r>
           </w:p>
         </w:tc>
         <w:tc>
@@ -1108,21 +999,7 @@
               <w:rPr>
                 <w:sz w:val="17"/>
               </w:rPr>
-              <w:t xml:space="preserve">Se hizo una rama independiente, la cual la interpretare como mi “Main” hasta que termine mis pruebas, correcciones y </w:t>
-            </w:r>
-            <w:proofErr w:type="spellStart"/>
-            <w:r>
-              <w:rPr>
-                <w:sz w:val="17"/>
-              </w:rPr>
-              <w:t>feat</w:t>
-            </w:r>
-            <w:proofErr w:type="spellEnd"/>
-            <w:r>
-              <w:rPr>
-                <w:sz w:val="17"/>
-              </w:rPr>
-              <w:t xml:space="preserve">, para de ahí sacar las ramas con las que trabajare estos días. </w:t>
+              <w:t xml:space="preserve">Se hizo una rama independiente, la cual la interpretare como mi “Main” hasta que termine mis pruebas, correcciones y feat, para de ahí sacar las ramas con las que trabajare estos días. </w:t>
             </w:r>
           </w:p>
         </w:tc>
@@ -1146,25 +1023,7 @@
           <w:color w:val="707B88"/>
           <w:sz w:val="16"/>
         </w:rPr>
-        <w:t xml:space="preserve">Separa comportamiento actual de esperado. Señala </w:t>
-      </w:r>
-      <w:proofErr w:type="gramStart"/>
-      <w:r>
-        <w:rPr>
-          <w:i/>
-          <w:color w:val="707B88"/>
-          <w:sz w:val="16"/>
-        </w:rPr>
-        <w:t>ticket</w:t>
-      </w:r>
-      <w:proofErr w:type="gramEnd"/>
-      <w:r>
-        <w:rPr>
-          <w:i/>
-          <w:color w:val="707B88"/>
-          <w:sz w:val="16"/>
-        </w:rPr>
-        <w:t>, registro y pasos exactos. Si tu sesión fue de funcionalidades, describe la condición previa y el comportamiento requerido.</w:t>
+        <w:t>Separa comportamiento actual de esperado. Señala ticket, registro y pasos exactos. Si tu sesión fue de funcionalidades, describe la condición previa y el comportamiento requerido.</w:t>
       </w:r>
     </w:p>
     <w:tbl>
@@ -1199,23 +1058,13 @@
             <w:pPr>
               <w:spacing w:after="0"/>
             </w:pPr>
-            <w:proofErr w:type="gramStart"/>
             <w:r>
               <w:rPr>
                 <w:b/>
                 <w:color w:val="174C83"/>
                 <w:sz w:val="16"/>
               </w:rPr>
-              <w:t>TICKET</w:t>
-            </w:r>
-            <w:proofErr w:type="gramEnd"/>
-            <w:r>
-              <w:rPr>
-                <w:b/>
-                <w:color w:val="174C83"/>
-                <w:sz w:val="16"/>
-              </w:rPr>
-              <w:t xml:space="preserve"> + PASOS PARA REPRODUCIR</w:t>
+              <w:t>TICKET + PASOS PARA REPRODUCIR</w:t>
             </w:r>
           </w:p>
         </w:tc>
@@ -1270,23 +1119,13 @@
                 <w:sz w:val="17"/>
               </w:rPr>
             </w:pPr>
-            <w:proofErr w:type="gramStart"/>
             <w:r>
               <w:rPr>
                 <w:b/>
                 <w:bCs/>
                 <w:sz w:val="17"/>
               </w:rPr>
-              <w:t>Ticket</w:t>
-            </w:r>
-            <w:proofErr w:type="gramEnd"/>
-            <w:r>
-              <w:rPr>
-                <w:b/>
-                <w:bCs/>
-                <w:sz w:val="17"/>
-              </w:rPr>
-              <w:t>:</w:t>
+              <w:t>Ticket:</w:t>
             </w:r>
             <w:r>
               <w:rPr>
@@ -1311,49 +1150,7 @@
               <w:rPr>
                 <w:sz w:val="17"/>
               </w:rPr>
-              <w:t xml:space="preserve">Abrir la </w:t>
-            </w:r>
-            <w:proofErr w:type="gramStart"/>
-            <w:r>
-              <w:rPr>
-                <w:sz w:val="17"/>
-              </w:rPr>
-              <w:t>app</w:t>
-            </w:r>
-            <w:proofErr w:type="gramEnd"/>
-            <w:r>
-              <w:rPr>
-                <w:sz w:val="17"/>
-              </w:rPr>
-              <w:t xml:space="preserve"> (usar </w:t>
-            </w:r>
-            <w:proofErr w:type="spellStart"/>
-            <w:r>
-              <w:rPr>
-                <w:sz w:val="17"/>
-              </w:rPr>
-              <w:t>flutter</w:t>
-            </w:r>
-            <w:proofErr w:type="spellEnd"/>
-            <w:r>
-              <w:rPr>
-                <w:sz w:val="17"/>
-              </w:rPr>
-              <w:t xml:space="preserve"> run -d </w:t>
-            </w:r>
-            <w:proofErr w:type="spellStart"/>
-            <w:r>
-              <w:rPr>
-                <w:sz w:val="17"/>
-              </w:rPr>
-              <w:t>chorme</w:t>
-            </w:r>
-            <w:proofErr w:type="spellEnd"/>
-            <w:r>
-              <w:rPr>
-                <w:sz w:val="17"/>
-              </w:rPr>
-              <w:t>). Se usó Brave en localhost.</w:t>
+              <w:t>Abrir la app (usar flutter run -d chorme). Se usó Brave en localhost.</w:t>
             </w:r>
           </w:p>
           <w:p>
@@ -1504,23 +1301,13 @@
             <w:pPr>
               <w:spacing w:after="0"/>
             </w:pPr>
-            <w:proofErr w:type="gramStart"/>
             <w:r>
               <w:rPr>
                 <w:b/>
                 <w:bCs/>
                 <w:sz w:val="17"/>
               </w:rPr>
-              <w:t>Ticket</w:t>
-            </w:r>
-            <w:proofErr w:type="gramEnd"/>
-            <w:r>
-              <w:rPr>
-                <w:b/>
-                <w:bCs/>
-                <w:sz w:val="17"/>
-              </w:rPr>
-              <w:t>:</w:t>
+              <w:t>Ticket:</w:t>
             </w:r>
             <w:r>
               <w:rPr>
@@ -1542,21 +1329,7 @@
               <w:rPr>
                 <w:sz w:val="17"/>
               </w:rPr>
-              <w:t xml:space="preserve">Abrir la </w:t>
-            </w:r>
-            <w:proofErr w:type="gramStart"/>
-            <w:r>
-              <w:rPr>
-                <w:sz w:val="17"/>
-              </w:rPr>
-              <w:t>app</w:t>
-            </w:r>
-            <w:proofErr w:type="gramEnd"/>
-            <w:r>
-              <w:rPr>
-                <w:sz w:val="17"/>
-              </w:rPr>
-              <w:t xml:space="preserve"> y quedarse en la lista principal.</w:t>
+              <w:t>Abrir la app y quedarse en la lista principal.</w:t>
             </w:r>
           </w:p>
           <w:p>
@@ -1588,35 +1361,7 @@
               <w:rPr>
                 <w:sz w:val="17"/>
               </w:rPr>
-              <w:t>Repetir con "Wifi", "túnel", "</w:t>
-            </w:r>
-            <w:proofErr w:type="spellStart"/>
-            <w:r>
-              <w:rPr>
-                <w:sz w:val="17"/>
-              </w:rPr>
-              <w:t>WiFi</w:t>
-            </w:r>
-            <w:proofErr w:type="spellEnd"/>
-            <w:r>
-              <w:rPr>
-                <w:sz w:val="17"/>
-              </w:rPr>
-              <w:t>", "</w:t>
-            </w:r>
-            <w:proofErr w:type="spellStart"/>
-            <w:r>
-              <w:rPr>
-                <w:sz w:val="17"/>
-              </w:rPr>
-              <w:t>WiFi</w:t>
-            </w:r>
-            <w:proofErr w:type="spellEnd"/>
-            <w:r>
-              <w:rPr>
-                <w:sz w:val="17"/>
-              </w:rPr>
-              <w:t xml:space="preserve"> intermitente" y "WiFi Intermitente".</w:t>
+              <w:t>Repetir con "Wifi", "túnel", "WiFi", "WiFi intermitente" y "WiFi Intermitente".</w:t>
             </w:r>
           </w:p>
         </w:tc>
@@ -1693,23 +1438,13 @@
             <w:pPr>
               <w:spacing w:after="0"/>
             </w:pPr>
-            <w:proofErr w:type="gramStart"/>
             <w:r>
               <w:rPr>
                 <w:b/>
                 <w:bCs/>
                 <w:sz w:val="17"/>
               </w:rPr>
-              <w:t>Ticket</w:t>
-            </w:r>
-            <w:proofErr w:type="gramEnd"/>
-            <w:r>
-              <w:rPr>
-                <w:b/>
-                <w:bCs/>
-                <w:sz w:val="17"/>
-              </w:rPr>
-              <w:t>:</w:t>
+              <w:t>Ticket:</w:t>
             </w:r>
             <w:r>
               <w:rPr>
@@ -2000,7 +1735,6 @@
               </w:rPr>
               <w:t xml:space="preserve"> </w:t>
             </w:r>
-            <w:proofErr w:type="spellStart"/>
             <w:r>
               <w:rPr>
                 <w:sz w:val="17"/>
@@ -2011,28 +1745,7 @@
               <w:rPr>
                 <w:sz w:val="17"/>
               </w:rPr>
-              <w:t>ambiarEstado</w:t>
-            </w:r>
-            <w:proofErr w:type="spellEnd"/>
-            <w:r>
-              <w:rPr>
-                <w:sz w:val="17"/>
-              </w:rPr>
-              <w:t xml:space="preserve"> cambia el estado en memoria y no llama a guardar (gestor_</w:t>
-            </w:r>
-            <w:proofErr w:type="gramStart"/>
-            <w:r>
-              <w:rPr>
-                <w:sz w:val="17"/>
-              </w:rPr>
-              <w:t>incidencias.dart</w:t>
-            </w:r>
-            <w:proofErr w:type="gramEnd"/>
-            <w:r>
-              <w:rPr>
-                <w:sz w:val="17"/>
-              </w:rPr>
-              <w:t>, L32-39), mientras que crear sí lo hace (L41-55). Pendiente de probar el Día 2.</w:t>
+              <w:t>ambiarEstado cambia el estado en memoria y no llama a guardar (gestor_incidencias.dart, L32-39), mientras que crear sí lo hace (L41-55). Pendiente de probar el Día 2.</w:t>
             </w:r>
           </w:p>
         </w:tc>
@@ -2160,23 +1873,7 @@
               <w:rPr>
                 <w:sz w:val="17"/>
               </w:rPr>
-              <w:t>uscar (</w:t>
-            </w:r>
-            <w:proofErr w:type="spellStart"/>
-            <w:proofErr w:type="gramStart"/>
-            <w:r>
-              <w:rPr>
-                <w:sz w:val="17"/>
-              </w:rPr>
-              <w:t>gestorincidencias.dart</w:t>
-            </w:r>
-            <w:proofErr w:type="spellEnd"/>
-            <w:proofErr w:type="gramEnd"/>
-            <w:r>
-              <w:rPr>
-                <w:sz w:val="17"/>
-              </w:rPr>
-              <w:t>, L15-18) filtra solo por título y sin ignorar mayúsculas. Pendiente de probar el Día 2.</w:t>
+              <w:t>uscar (gestorincidencias.dart, L15-18) filtra solo por título y sin ignorar mayúsculas. Pendiente de probar el Día 2.</w:t>
             </w:r>
           </w:p>
         </w:tc>
@@ -2350,7 +2047,6 @@
             <w:pPr>
               <w:spacing w:after="0"/>
             </w:pPr>
-            <w:proofErr w:type="gramStart"/>
             <w:r>
               <w:rPr>
                 <w:b/>
@@ -2359,7 +2055,6 @@
               </w:rPr>
               <w:t>TICKET</w:t>
             </w:r>
-            <w:proofErr w:type="gramEnd"/>
           </w:p>
         </w:tc>
         <w:tc>
@@ -2885,7 +2580,7 @@
                 <w:b/>
                 <w:sz w:val="17"/>
               </w:rPr>
-              <w:t xml:space="preserve">Estado inicial (sin ticket)</w:t>
+              <w:t>Estado inicial (sin ticket)</w:t>
             </w:r>
           </w:p>
         </w:tc>
@@ -2909,13 +2604,13 @@
                 <w:b/>
                 <w:sz w:val="17"/>
               </w:rPr>
-              <w:t xml:space="preserve">Proyecto preparado con flutter create</w:t>
-            </w:r>
-            <w:r>
-              <w:rPr>
-                <w:sz w:val="17"/>
-              </w:rPr>
-              <w:t xml:space="preserve">: carpetas android/, web/ y windows/, pubspec.lock, analysis_options.yaml y .gitignore (se agregó tareas/evidencias/). Sin cambios en lib/ ni en assets/.</w:t>
+              <w:t>Proyecto preparado con flutter create</w:t>
+            </w:r>
+            <w:r>
+              <w:rPr>
+                <w:sz w:val="17"/>
+              </w:rPr>
+              <w:t>: carpetas android/, web/ y windows/, pubspec.lock, analysis_options.yaml y .gitignore (se agregó tareas/evidencias/). Sin cambios en lib/ ni en assets/.</w:t>
             </w:r>
           </w:p>
         </w:tc>
@@ -2939,7 +2634,7 @@
                 <w:b/>
                 <w:sz w:val="17"/>
               </w:rPr>
-              <w:t xml:space="preserve">d02af76</w:t>
+              <w:t>d02af76</w:t>
             </w:r>
             <w:r>
               <w:rPr>
@@ -2955,7 +2650,7 @@
                 <w:b/>
                 <w:sz w:val="17"/>
               </w:rPr>
-              <w:t xml:space="preserve">061edab</w:t>
+              <w:t>061edab</w:t>
             </w:r>
             <w:r>
               <w:rPr>
@@ -2971,7 +2666,7 @@
                 <w:b/>
                 <w:sz w:val="17"/>
               </w:rPr>
-              <w:t xml:space="preserve">0488515</w:t>
+              <w:t>0488515</w:t>
             </w:r>
             <w:r>
               <w:rPr>
@@ -2986,7 +2681,7 @@
               <w:rPr>
                 <w:sz w:val="17"/>
               </w:rPr>
-              <w:t xml:space="preserve">Rama practica/dia1 (local)</w:t>
+              <w:t>Rama practica/dia1 (local)</w:t>
             </w:r>
           </w:p>
         </w:tc>
@@ -3030,25 +2725,7 @@
           <w:color w:val="707B88"/>
           <w:sz w:val="16"/>
         </w:rPr>
-        <w:t xml:space="preserve">Inserta capturas propias y legibles reemplazando cada recuadro. Toda imagen debe indicar </w:t>
-      </w:r>
-      <w:proofErr w:type="gramStart"/>
-      <w:r>
-        <w:rPr>
-          <w:i/>
-          <w:color w:val="707B88"/>
-          <w:sz w:val="16"/>
-        </w:rPr>
-        <w:t>ticket</w:t>
-      </w:r>
-      <w:proofErr w:type="gramEnd"/>
-      <w:r>
-        <w:rPr>
-          <w:i/>
-          <w:color w:val="707B88"/>
-          <w:sz w:val="16"/>
-        </w:rPr>
-        <w:t>, ID, acción y resultado. Puedes añadir más evidencias en páginas nuevas.</w:t>
+        <w:t>Inserta capturas propias y legibles reemplazando cada recuadro. Toda imagen debe indicar ticket, ID, acción y resultado. Puedes añadir más evidencias en páginas nuevas.</w:t>
       </w:r>
     </w:p>
     <w:tbl>
@@ -4774,7 +4451,7 @@
                 <w:color w:val="174C83"/>
                 <w:sz w:val="16"/>
               </w:rPr>
-              <w:t xml:space="preserve">E15  ·  HISTORIAL DE GIT DEL ESTADO INICIAL (git log)</w:t>
+              <w:t>E15  ·  HISTORIAL DE GIT DEL ESTADO INICIAL (git log)</w:t>
             </w:r>
           </w:p>
         </w:tc>
@@ -4798,13 +4475,17 @@
           </w:tcPr>
           <w:p>
             <w:pPr>
-              <w:spacing w:before="60" w:after="60"/>
+              <w:spacing w:before="60"/>
               <w:jc w:val="center"/>
             </w:pPr>
             <w:r>
+              <w:rPr>
+                <w:noProof/>
+              </w:rPr>
               <w:drawing>
-                <wp:inline distT="0" distB="0" distL="0" distR="0">
+                <wp:inline distT="0" distB="0" distL="0" distR="0" wp14:anchorId="0316EBE5" wp14:editId="21645F79">
                   <wp:extent cx="5760720" cy="523196"/>
+                  <wp:effectExtent l="0" t="0" r="0" b="0"/>
                   <wp:docPr id="215" name="Evidencia E15" descr="git log del estado inicial en la rama practica/dia1"/>
                   <wp:cNvGraphicFramePr>
                     <a:graphicFrameLocks xmlns:a="http://schemas.openxmlformats.org/drawingml/2006/main" noChangeAspect="1"/>
@@ -4817,7 +4498,7 @@
                           <pic:cNvPicPr/>
                         </pic:nvPicPr>
                         <pic:blipFill>
-                          <a:blip r:embed="rId915"/>
+                          <a:blip r:embed="rId22"/>
                           <a:stretch>
                             <a:fillRect/>
                           </a:stretch>
@@ -4849,7 +4530,7 @@
         <w:rPr>
           <w:sz w:val="16"/>
         </w:rPr>
-        <w:t xml:space="preserve">Ticket: Estado inicial (sin ticket)   ID/escenario: git log --oneline -4 en la rama practica/dia1   Qué demuestra: Los tres commits del estado inicial (d02af76, 061edab y 0488515) sobre el commit base 93f22d4 de grupo-7A. Sin cambios de código   Fecha: 14/10/2026</w:t>
+        <w:t>Ticket: Estado inicial (sin ticket)   ID/escenario: git log --oneline -4 en la rama practica/dia1   Qué demuestra: Los tres commits del estado inicial (d02af76, 061edab y 0488515) sobre el commit base 93f22d4 de grupo-7A. Sin cambios de código   Fecha: 14/10/2026</w:t>
       </w:r>
     </w:p>
     <w:p>
@@ -5135,21 +4816,7 @@
               <w:rPr>
                 <w:sz w:val="17"/>
               </w:rPr>
-              <w:t xml:space="preserve">Abrir la </w:t>
-            </w:r>
-            <w:proofErr w:type="gramStart"/>
-            <w:r>
-              <w:rPr>
-                <w:sz w:val="17"/>
-              </w:rPr>
-              <w:t>app</w:t>
-            </w:r>
-            <w:proofErr w:type="gramEnd"/>
-            <w:r>
-              <w:rPr>
-                <w:sz w:val="17"/>
-              </w:rPr>
-              <w:t xml:space="preserve"> sin modificar nada y contar los estados de la lista (E1 y E2) contra el tablero</w:t>
+              <w:t>Abrir la app sin modificar nada y contar los estados de la lista (E1 y E2) contra el tablero</w:t>
             </w:r>
           </w:p>
         </w:tc>
@@ -5678,6 +5345,7 @@
                 <w:bCs/>
                 <w:sz w:val="17"/>
               </w:rPr>
+              <w:lastRenderedPageBreak/>
               <w:t>BUG-002:</w:t>
             </w:r>
             <w:r>
@@ -5978,7 +5646,6 @@
         <w:pStyle w:val="Ttulo1"/>
       </w:pPr>
       <w:r>
-        <w:lastRenderedPageBreak/>
         <w:t>7. Uso de IA y confidencialidad</w:t>
       </w:r>
     </w:p>
@@ -6078,7 +5745,6 @@
               </w:rPr>
               <w:t xml:space="preserve">¿Usaste IA?  Sí [ </w:t>
             </w:r>
-            <w:proofErr w:type="gramStart"/>
             <w:r>
               <w:rPr>
                 <w:sz w:val="17"/>
@@ -6089,23 +5755,8 @@
               <w:rPr>
                 <w:sz w:val="17"/>
               </w:rPr>
-              <w:t xml:space="preserve"> ]</w:t>
-            </w:r>
-            <w:proofErr w:type="gramEnd"/>
-            <w:r>
-              <w:rPr>
-                <w:sz w:val="17"/>
-              </w:rPr>
-              <w:t xml:space="preserve">  No </w:t>
-            </w:r>
-            <w:proofErr w:type="gramStart"/>
-            <w:r>
-              <w:rPr>
-                <w:sz w:val="17"/>
-              </w:rPr>
-              <w:t>[  ]</w:t>
-            </w:r>
-            <w:proofErr w:type="gramEnd"/>
+              <w:t xml:space="preserve"> ]  No [  ]</w:t>
+            </w:r>
             <w:r>
               <w:rPr>
                 <w:sz w:val="17"/>
@@ -6141,19 +5792,114 @@
           <w:p>
             <w:pPr>
               <w:spacing w:after="0"/>
+              <w:rPr>
+                <w:sz w:val="17"/>
+              </w:rPr>
             </w:pPr>
             <w:r>
               <w:rPr>
-                <w:sz w:val="17"/>
-              </w:rPr>
-              <w:t>Objetivo de consulta: Entender qué se pide en el Día 1 de la práctica, ordenar la preparación del proyecto y la evidencia, entender la estructura del código y armar el mapa de componentes y las notas de investigación, y recibir apoyo para redactar esta bitácora.</w:t>
-            </w:r>
-            <w:r>
-              <w:rPr>
-                <w:sz w:val="17"/>
-              </w:rPr>
-              <w:br/>
-              <w:t>Prompt resumido y sanitizado: Pedí que leyera la guía de la práctica y la plantilla de bitácora y que me explicara qué hacer el Día 1. Compartí capturas de la app (datos ficticios) para ordenarlas y redactar sus pies de evidencia. Después autoricé que leyera los archivos de lib/ y el JSON de ejemplo para describir cómo está organizada la app (archivo, función y números de línea, sin copiar líneas de código) y dibujar el mapa. No se pidió corregir nada y no se modificó código.</w:t>
+                <w:b/>
+                <w:bCs/>
+                <w:sz w:val="17"/>
+              </w:rPr>
+              <w:t>Objetivo de consulta:</w:t>
+            </w:r>
+            <w:r>
+              <w:rPr>
+                <w:sz w:val="17"/>
+              </w:rPr>
+              <w:t xml:space="preserve"> Darme ejemplos de cómo realizar una bitácora con referencias de internet</w:t>
+            </w:r>
+            <w:r>
+              <w:rPr>
+                <w:sz w:val="17"/>
+              </w:rPr>
+              <w:t xml:space="preserve">, </w:t>
+            </w:r>
+            <w:r>
+              <w:rPr>
+                <w:sz w:val="17"/>
+              </w:rPr>
+              <w:t>ordenar las capturas de pantallas para que tuvieran un mejor entendimiento</w:t>
+            </w:r>
+            <w:r>
+              <w:rPr>
+                <w:sz w:val="17"/>
+              </w:rPr>
+              <w:t xml:space="preserve">, </w:t>
+            </w:r>
+            <w:r>
+              <w:rPr>
+                <w:sz w:val="17"/>
+              </w:rPr>
+              <w:t xml:space="preserve">estilizar el </w:t>
+            </w:r>
+            <w:r>
+              <w:rPr>
+                <w:sz w:val="17"/>
+              </w:rPr>
+              <w:t>mapa de componentes</w:t>
+            </w:r>
+            <w:r>
+              <w:rPr>
+                <w:sz w:val="17"/>
+              </w:rPr>
+              <w:t xml:space="preserve"> (NO lo armo, yo lo hice)</w:t>
+            </w:r>
+            <w:r>
+              <w:rPr>
+                <w:sz w:val="17"/>
+              </w:rPr>
+              <w:t xml:space="preserve"> </w:t>
+            </w:r>
+            <w:r>
+              <w:rPr>
+                <w:sz w:val="17"/>
+              </w:rPr>
+              <w:t>y revisarme el formato y la ortografía final, además de que estuviera redactado de manera que no fuese redundante.</w:t>
+            </w:r>
+          </w:p>
+          <w:p>
+            <w:pPr>
+              <w:spacing w:after="0"/>
+            </w:pPr>
+            <w:r>
+              <w:rPr>
+                <w:b/>
+                <w:bCs/>
+                <w:sz w:val="17"/>
+              </w:rPr>
+              <w:t>Prompt resumido y sanitizado:</w:t>
+            </w:r>
+            <w:r>
+              <w:rPr>
+                <w:sz w:val="17"/>
+              </w:rPr>
+              <w:t xml:space="preserve"> Compartí capturas de la app (datos ficticios) para ordenarlas y redactar sus pies de evidencia. Después </w:t>
+            </w:r>
+            <w:r>
+              <w:rPr>
+                <w:sz w:val="17"/>
+              </w:rPr>
+              <w:t>le di el mapa de componentes hecho por mi para que me lo estilizara con figma</w:t>
+            </w:r>
+            <w:r>
+              <w:rPr>
+                <w:sz w:val="17"/>
+              </w:rPr>
+              <w:t>. No se pidió corregir nada y no se modificó código</w:t>
+            </w:r>
+            <w:r>
+              <w:rPr>
+                <w:sz w:val="17"/>
+              </w:rPr>
+              <w:t xml:space="preserve"> y al final verificar el formato de la bitacora</w:t>
+            </w:r>
+            <w:r>
+              <w:rPr>
+                <w:sz w:val="17"/>
+              </w:rPr>
+              <w:t>.</w:t>
             </w:r>
           </w:p>
         </w:tc>
@@ -6190,7 +5936,19 @@
                 <w:sz w:val="17"/>
               </w:rPr>
               <w:br/>
-              <w:t>Otro: texto de la guía y de la bitácora, capturas de la app con datos ficticios y el código fuente de lib/ y el JSON de ejemplo (leídos por la herramienta). Sin credenciales.</w:t>
+              <w:t xml:space="preserve">Otro: texto de la guía y de la bitácora, capturas de la app con datos ficticios y </w:t>
+            </w:r>
+            <w:r>
+              <w:rPr>
+                <w:sz w:val="17"/>
+              </w:rPr>
+              <w:t>la imagen del mapa de componentes y revisión final</w:t>
+            </w:r>
+            <w:r>
+              <w:rPr>
+                <w:sz w:val="17"/>
+              </w:rPr>
+              <w:t>. Sin credenciales.</w:t>
             </w:r>
           </w:p>
         </w:tc>
@@ -6213,7 +5971,19 @@
               <w:rPr>
                 <w:sz w:val="17"/>
               </w:rPr>
-              <w:t>Medidas de confidencialidad: El proyecto es una práctica con datos ficticios, no un sistema real de un cliente. Permití que la herramienta leyera solo la guía, mi bitácora y los archivos de lib/ y assets/ del proyecto; no tiene acceso a contraseñas, claves, tokens ni configuraciones. En el mapa y en las notas solo se usaron nombres de funciones y números de línea, sin copiar líneas de código. La herramienta corre en mi terminal y solo lee los archivos que se le piden.</w:t>
+              <w:t xml:space="preserve">Medidas de confidencialidad: El proyecto es una práctica con datos ficticios, no un sistema real de un cliente. Permití que la herramienta leyera solo la guía, mi bitácora y </w:t>
+            </w:r>
+            <w:r>
+              <w:rPr>
+                <w:sz w:val="17"/>
+              </w:rPr>
+              <w:t>mis capturas</w:t>
+            </w:r>
+            <w:r>
+              <w:rPr>
+                <w:sz w:val="17"/>
+              </w:rPr>
+              <w:t>; no tiene acceso a contraseñas, claves, tokens ni configuraciones. En el mapa y en las notas solo se usaron nombres de funciones y números de línea, sin copiar líneas de código. La herramienta corre en mi terminal y solo lee los archivos que se le piden.</w:t>
             </w:r>
           </w:p>
         </w:tc>
@@ -6250,7 +6020,31 @@
                 <w:sz w:val="17"/>
               </w:rPr>
               <w:br/>
-              <w:t>Aceptada: orden de pasos del Día 1, qué va en cada sección de la bitácora, la descripción de la estructura del código y el mapa. Las causas probables de los bugs se aceptaron solo como hipótesis. Rechazada: adelantar decisiones de Git (fork, ramas, push), que no corresponden al Día 1.</w:t>
+              <w:t>Aceptada:</w:t>
+            </w:r>
+            <w:r>
+              <w:rPr>
+                <w:sz w:val="17"/>
+              </w:rPr>
+              <w:t xml:space="preserve"> Ejemplos de estructuración de bitácoras</w:t>
+            </w:r>
+            <w:r>
+              <w:rPr>
+                <w:sz w:val="17"/>
+              </w:rPr>
+              <w:t>, el mapa</w:t>
+            </w:r>
+            <w:r>
+              <w:rPr>
+                <w:sz w:val="17"/>
+              </w:rPr>
+              <w:t xml:space="preserve"> de componentes y al final, revisión de mi bitácora</w:t>
+            </w:r>
+            <w:r>
+              <w:rPr>
+                <w:sz w:val="17"/>
+              </w:rPr>
+              <w:t>. Las causas probables de los bugs se aceptaron solo como hipótesis.</w:t>
             </w:r>
           </w:p>
         </w:tc>
@@ -6273,7 +6067,19 @@
               <w:rPr>
                 <w:sz w:val="17"/>
               </w:rPr>
-              <w:t>Comprobación propia: Reproduje los tres bugs yo mismo en la app (E3 a E13) y conté a mano los estados de la lista contra el tablero (matriz de pruebas, fila 2). Las causas que aparecen en el mapa y en las hipótesis salen de la lectura del código hecha con la herramienta y aún no se han probado: se confirmarán el Día 2 modificando el código y repitiendo las pruebas de la matriz.</w:t>
+              <w:t xml:space="preserve">Comprobación propia: Reproduje los tres bugs yo mismo en la app (E3 a E13) y conté a mano los estados de la lista contra el tablero (matriz de pruebas, fila 2). Las causas que aparecen en el mapa y en las hipótesis salen de la lectura del código hecha </w:t>
+            </w:r>
+            <w:r>
+              <w:rPr>
+                <w:sz w:val="17"/>
+              </w:rPr>
+              <w:t xml:space="preserve">por mi y estilizada por la IA </w:t>
+            </w:r>
+            <w:r>
+              <w:rPr>
+                <w:sz w:val="17"/>
+              </w:rPr>
+              <w:t>y aún no se han probado: se confirmarán el Día 2 modificando el código y repitiendo las pruebas de la matriz.</w:t>
             </w:r>
           </w:p>
         </w:tc>
@@ -6289,25 +6095,7 @@
           <w:color w:val="707B88"/>
           <w:sz w:val="16"/>
         </w:rPr>
-        <w:t xml:space="preserve">Si NO utilizaste IA, marca No e indica brevemente cómo investigaste. No pegues código confidencial, </w:t>
-      </w:r>
-      <w:proofErr w:type="spellStart"/>
-      <w:r>
-        <w:rPr>
-          <w:i/>
-          <w:color w:val="707B88"/>
-          <w:sz w:val="16"/>
-        </w:rPr>
-        <w:t>prompts</w:t>
-      </w:r>
-      <w:proofErr w:type="spellEnd"/>
-      <w:r>
-        <w:rPr>
-          <w:i/>
-          <w:color w:val="707B88"/>
-          <w:sz w:val="16"/>
-        </w:rPr>
-        <w:t xml:space="preserve"> con datos privados ni conversaciones completas.</w:t>
+        <w:t>Si NO utilizaste IA, marca No e indica brevemente cómo investigaste. No pegues código confidencial, prompts con datos privados ni conversaciones completas.</w:t>
       </w:r>
     </w:p>
     <w:p>
@@ -6444,14 +6232,14 @@
               <w:rPr>
                 <w:sz w:val="17"/>
               </w:rPr>
-              <w:t xml:space="preserve">Siguiente acción concreta: Empezar el Día 2: corregir BUG-001, BUG-002 y BUG-003, una rama por ticket a partir de practica/dia1.</w:t>
+              <w:t>Siguiente acción concreta: Empezar el Día 2: corregir BUG-001, BUG-002 y BUG-003, una rama por ticket a partir de practica/dia1.</w:t>
             </w:r>
             <w:r>
               <w:rPr>
                 <w:sz w:val="17"/>
               </w:rPr>
               <w:br/>
-              <w:t xml:space="preserve">¿Qué evidencia falta conseguir?: Pruebas antes y después de cada corrección y el hash de cada commit.</w:t>
+              <w:t>¿Qué evidencia falta conseguir?: Pruebas antes y después de cada corrección y el hash de cada commit.</w:t>
             </w:r>
           </w:p>
         </w:tc>
@@ -6459,12 +6247,12 @@
     </w:tbl>
     <w:p/>
     <w:sectPr>
-      <w:headerReference w:type="even" r:id="rId22"/>
-      <w:headerReference w:type="default" r:id="rId23"/>
-      <w:footerReference w:type="even" r:id="rId24"/>
-      <w:footerReference w:type="default" r:id="rId25"/>
-      <w:headerReference w:type="first" r:id="rId26"/>
-      <w:footerReference w:type="first" r:id="rId27"/>
+      <w:headerReference w:type="even" r:id="rId23"/>
+      <w:headerReference w:type="default" r:id="rId24"/>
+      <w:footerReference w:type="even" r:id="rId25"/>
+      <w:footerReference w:type="default" r:id="rId26"/>
+      <w:headerReference w:type="first" r:id="rId27"/>
+      <w:footerReference w:type="first" r:id="rId28"/>
       <w:pgSz w:w="12240" w:h="15840"/>
       <w:pgMar w:top="1037" w:right="1037" w:bottom="922" w:left="1037" w:header="461" w:footer="490" w:gutter="0"/>
       <w:cols w:space="720"/>

</xml_diff>